<commit_message>
switch to Claude Code workflow — add CLAUDE.md
</commit_message>
<xml_diff>
--- a/BR DEPL GUIDES/BangerRatios_2.0_Changes copy.docx
+++ b/BR DEPL GUIDES/BangerRatios_2.0_Changes copy.docx
@@ -17529,13 +17529,8 @@
     </w:p>
     <w:p>
       <w:r>
-        <w:rPr>
-          <w:noProof/>
-        </w:rPr>
-      </w:r>
-      <w:r>
-        <w:pict w14:anchorId="720AD0B1">
-          <v:rect id="Rectangle 29" o:spid="_x0000_s1040" style="width:7in;height:.1pt;visibility:visible;mso-wrap-style:square;mso-left-percent:-10001;mso-top-percent:-10001;mso-position-horizontal:absolute;mso-position-horizontal-relative:char;mso-position-vertical:absolute;mso-position-vertical-relative:line;mso-left-percent:-10001;mso-top-percent:-10001;v-text-anchor:top" o:gfxdata="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" filled="f">
+        <w:pict w14:anchorId="610104FD">
+          <v:rect id="Rectangle 29" o:spid="_x0000_s1040" alt="" style="width:7in;height:.1pt;visibility:visible;mso-wrap-style:square;mso-width-percent:0;mso-height-percent:0;mso-left-percent:-10001;mso-top-percent:-10001;mso-position-horizontal:absolute;mso-position-horizontal-relative:char;mso-position-vertical:absolute;mso-position-vertical-relative:line;mso-width-percent:0;mso-height-percent:0;mso-left-percent:-10001;mso-top-percent:-10001;v-text-anchor:top" filled="f">
             <o:lock v:ext="edit" aspectratio="t"/>
             <w10:anchorlock/>
           </v:rect>
@@ -17704,13 +17699,8 @@
     </w:p>
     <w:p>
       <w:r>
-        <w:rPr>
-          <w:noProof/>
-        </w:rPr>
-      </w:r>
-      <w:r>
-        <w:pict w14:anchorId="63B7237C">
-          <v:rect id="Rectangle 27" o:spid="_x0000_s1039" style="width:7in;height:.1pt;visibility:visible;mso-wrap-style:square;mso-left-percent:-10001;mso-top-percent:-10001;mso-position-horizontal:absolute;mso-position-horizontal-relative:char;mso-position-vertical:absolute;mso-position-vertical-relative:line;mso-left-percent:-10001;mso-top-percent:-10001;v-text-anchor:top" o:gfxdata="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" filled="f">
+        <w:pict w14:anchorId="3E7987C9">
+          <v:rect id="Rectangle 27" o:spid="_x0000_s1039" alt="" style="width:7in;height:.1pt;visibility:visible;mso-wrap-style:square;mso-width-percent:0;mso-height-percent:0;mso-left-percent:-10001;mso-top-percent:-10001;mso-position-horizontal:absolute;mso-position-horizontal-relative:char;mso-position-vertical:absolute;mso-position-vertical-relative:line;mso-width-percent:0;mso-height-percent:0;mso-left-percent:-10001;mso-top-percent:-10001;v-text-anchor:top" filled="f">
             <o:lock v:ext="edit" aspectratio="t"/>
             <w10:anchorlock/>
           </v:rect>
@@ -18249,13 +18239,8 @@
     </w:p>
     <w:p>
       <w:r>
-        <w:rPr>
-          <w:noProof/>
-        </w:rPr>
-      </w:r>
-      <w:r>
-        <w:pict w14:anchorId="0B09FFEE">
-          <v:rect id="Rectangle 25" o:spid="_x0000_s1038" style="width:7in;height:.1pt;visibility:visible;mso-wrap-style:square;mso-left-percent:-10001;mso-top-percent:-10001;mso-position-horizontal:absolute;mso-position-horizontal-relative:char;mso-position-vertical:absolute;mso-position-vertical-relative:line;mso-left-percent:-10001;mso-top-percent:-10001;v-text-anchor:top" o:gfxdata="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" filled="f">
+        <w:pict w14:anchorId="6EAE6697">
+          <v:rect id="Rectangle 25" o:spid="_x0000_s1038" alt="" style="width:7in;height:.1pt;visibility:visible;mso-wrap-style:square;mso-width-percent:0;mso-height-percent:0;mso-left-percent:-10001;mso-top-percent:-10001;mso-position-horizontal:absolute;mso-position-horizontal-relative:char;mso-position-vertical:absolute;mso-position-vertical-relative:line;mso-width-percent:0;mso-height-percent:0;mso-left-percent:-10001;mso-top-percent:-10001;v-text-anchor:top" filled="f">
             <o:lock v:ext="edit" aspectratio="t"/>
             <w10:anchorlock/>
           </v:rect>
@@ -19210,13 +19195,8 @@
     </w:p>
     <w:p>
       <w:r>
-        <w:rPr>
-          <w:noProof/>
-        </w:rPr>
-      </w:r>
-      <w:r>
-        <w:pict w14:anchorId="70102E82">
-          <v:rect id="Rectangle 23" o:spid="_x0000_s1037" style="width:7in;height:.1pt;visibility:visible;mso-wrap-style:square;mso-left-percent:-10001;mso-top-percent:-10001;mso-position-horizontal:absolute;mso-position-horizontal-relative:char;mso-position-vertical:absolute;mso-position-vertical-relative:line;mso-left-percent:-10001;mso-top-percent:-10001;v-text-anchor:top" o:gfxdata="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" filled="f">
+        <w:pict w14:anchorId="07FB4624">
+          <v:rect id="Rectangle 23" o:spid="_x0000_s1037" alt="" style="width:7in;height:.1pt;visibility:visible;mso-wrap-style:square;mso-width-percent:0;mso-height-percent:0;mso-left-percent:-10001;mso-top-percent:-10001;mso-position-horizontal:absolute;mso-position-horizontal-relative:char;mso-position-vertical:absolute;mso-position-vertical-relative:line;mso-width-percent:0;mso-height-percent:0;mso-left-percent:-10001;mso-top-percent:-10001;v-text-anchor:top" filled="f">
             <o:lock v:ext="edit" aspectratio="t"/>
             <w10:anchorlock/>
           </v:rect>
@@ -19442,7 +19422,7 @@
         <w:rPr>
           <w:noProof/>
         </w:rPr>
-        <w:pict w14:anchorId="1DF424A6">
+        <w:pict w14:anchorId="08FF4E95">
           <v:rect id="_x0000_i1057" alt="" style="width:468pt;height:.05pt;mso-width-percent:0;mso-height-percent:0;mso-width-percent:0;mso-height-percent:0" o:hralign="center" o:hrstd="t" o:hr="t" fillcolor="#a0a0a0" stroked="f"/>
         </w:pict>
       </w:r>
@@ -19605,7 +19585,7 @@
         <w:rPr>
           <w:noProof/>
         </w:rPr>
-        <w:pict w14:anchorId="4B791B2C">
+        <w:pict w14:anchorId="367FD427">
           <v:rect id="_x0000_i1056" alt="" style="width:468pt;height:.05pt;mso-width-percent:0;mso-height-percent:0;mso-width-percent:0;mso-height-percent:0" o:hralign="center" o:hrstd="t" o:hr="t" fillcolor="#a0a0a0" stroked="f"/>
         </w:pict>
       </w:r>
@@ -19805,7 +19785,7 @@
         <w:rPr>
           <w:noProof/>
         </w:rPr>
-        <w:pict w14:anchorId="10CA1C3D">
+        <w:pict w14:anchorId="7B42FD13">
           <v:rect id="_x0000_i1055" alt="" style="width:468pt;height:.05pt;mso-width-percent:0;mso-height-percent:0;mso-width-percent:0;mso-height-percent:0" o:hralign="center" o:hrstd="t" o:hr="t" fillcolor="#a0a0a0" stroked="f"/>
         </w:pict>
       </w:r>
@@ -20023,7 +20003,7 @@
         <w:rPr>
           <w:noProof/>
         </w:rPr>
-        <w:pict w14:anchorId="66867054">
+        <w:pict w14:anchorId="055CCD18">
           <v:rect id="_x0000_i1054" alt="" style="width:468pt;height:.05pt;mso-width-percent:0;mso-height-percent:0;mso-width-percent:0;mso-height-percent:0" o:hralign="center" o:hrstd="t" o:hr="t" fillcolor="#a0a0a0" stroked="f"/>
         </w:pict>
       </w:r>
@@ -20047,7 +20027,7 @@
         <w:rPr>
           <w:noProof/>
         </w:rPr>
-        <w:pict w14:anchorId="2D13D86E">
+        <w:pict w14:anchorId="51C98A86">
           <v:rect id="_x0000_i1053" alt="" style="width:468pt;height:.05pt;mso-width-percent:0;mso-height-percent:0;mso-width-percent:0;mso-height-percent:0" o:hralign="center" o:hrstd="t" o:hr="t" fillcolor="#a0a0a0" stroked="f"/>
         </w:pict>
       </w:r>
@@ -20275,7 +20255,7 @@
         <w:rPr>
           <w:noProof/>
         </w:rPr>
-        <w:pict w14:anchorId="45FEC204">
+        <w:pict w14:anchorId="53BED687">
           <v:rect id="_x0000_i1052" alt="" style="width:468pt;height:.05pt;mso-width-percent:0;mso-height-percent:0;mso-width-percent:0;mso-height-percent:0" o:hralign="center" o:hrstd="t" o:hr="t" fillcolor="#a0a0a0" stroked="f"/>
         </w:pict>
       </w:r>
@@ -20461,7 +20441,7 @@
         <w:rPr>
           <w:noProof/>
         </w:rPr>
-        <w:pict w14:anchorId="50692FA7">
+        <w:pict w14:anchorId="045DA817">
           <v:rect id="_x0000_i1051" alt="" style="width:468pt;height:.05pt;mso-width-percent:0;mso-height-percent:0;mso-width-percent:0;mso-height-percent:0" o:hralign="center" o:hrstd="t" o:hr="t" fillcolor="#a0a0a0" stroked="f"/>
         </w:pict>
       </w:r>
@@ -20485,7 +20465,7 @@
         <w:rPr>
           <w:noProof/>
         </w:rPr>
-        <w:pict w14:anchorId="64501DC0">
+        <w:pict w14:anchorId="0D25A11E">
           <v:rect id="_x0000_i1050" alt="" style="width:468pt;height:.05pt;mso-width-percent:0;mso-height-percent:0;mso-width-percent:0;mso-height-percent:0" o:hralign="center" o:hrstd="t" o:hr="t" fillcolor="#a0a0a0" stroked="f"/>
         </w:pict>
       </w:r>
@@ -20672,7 +20652,7 @@
         <w:rPr>
           <w:noProof/>
         </w:rPr>
-        <w:pict w14:anchorId="6B724750">
+        <w:pict w14:anchorId="6C98A24A">
           <v:rect id="_x0000_i1049" alt="" style="width:468pt;height:.05pt;mso-width-percent:0;mso-height-percent:0;mso-width-percent:0;mso-height-percent:0" o:hralign="center" o:hrstd="t" o:hr="t" fillcolor="#a0a0a0" stroked="f"/>
         </w:pict>
       </w:r>
@@ -20850,7 +20830,7 @@
         <w:rPr>
           <w:noProof/>
         </w:rPr>
-        <w:pict w14:anchorId="219E9603">
+        <w:pict w14:anchorId="4F50207F">
           <v:rect id="_x0000_i1048" alt="" style="width:468pt;height:.05pt;mso-width-percent:0;mso-height-percent:0;mso-width-percent:0;mso-height-percent:0" o:hralign="center" o:hrstd="t" o:hr="t" fillcolor="#a0a0a0" stroked="f"/>
         </w:pict>
       </w:r>
@@ -20874,7 +20854,7 @@
         <w:rPr>
           <w:noProof/>
         </w:rPr>
-        <w:pict w14:anchorId="7FCCE97C">
+        <w:pict w14:anchorId="1A30D6F8">
           <v:rect id="_x0000_i1047" alt="" style="width:468pt;height:.05pt;mso-width-percent:0;mso-height-percent:0;mso-width-percent:0;mso-height-percent:0" o:hralign="center" o:hrstd="t" o:hr="t" fillcolor="#a0a0a0" stroked="f"/>
         </w:pict>
       </w:r>
@@ -21116,7 +21096,7 @@
         <w:rPr>
           <w:noProof/>
         </w:rPr>
-        <w:pict w14:anchorId="2FA2C23C">
+        <w:pict w14:anchorId="19605405">
           <v:rect id="_x0000_i1046" alt="" style="width:468pt;height:.05pt;mso-width-percent:0;mso-height-percent:0;mso-width-percent:0;mso-height-percent:0" o:hralign="center" o:hrstd="t" o:hr="t" fillcolor="#a0a0a0" stroked="f"/>
         </w:pict>
       </w:r>
@@ -21352,7 +21332,7 @@
         <w:rPr>
           <w:noProof/>
         </w:rPr>
-        <w:pict w14:anchorId="704AAE0D">
+        <w:pict w14:anchorId="05531B44">
           <v:rect id="_x0000_i1045" alt="" style="width:468pt;height:.05pt;mso-width-percent:0;mso-height-percent:0;mso-width-percent:0;mso-height-percent:0" o:hralign="center" o:hrstd="t" o:hr="t" fillcolor="#a0a0a0" stroked="f"/>
         </w:pict>
       </w:r>
@@ -21383,7 +21363,7 @@
         <w:rPr>
           <w:noProof/>
         </w:rPr>
-        <w:pict w14:anchorId="39CDDD6F">
+        <w:pict w14:anchorId="0DEB0553">
           <v:rect id="_x0000_i1044" alt="" style="width:468pt;height:.05pt;mso-width-percent:0;mso-height-percent:0;mso-width-percent:0;mso-height-percent:0" o:hralign="center" o:hrstd="t" o:hr="t" fillcolor="#a0a0a0" stroked="f"/>
         </w:pict>
       </w:r>
@@ -21555,7 +21535,7 @@
         <w:rPr>
           <w:noProof/>
         </w:rPr>
-        <w:pict w14:anchorId="09F3061D">
+        <w:pict w14:anchorId="729223F1">
           <v:rect id="_x0000_i1043" alt="" style="width:468pt;height:.05pt;mso-width-percent:0;mso-height-percent:0;mso-width-percent:0;mso-height-percent:0" o:hralign="center" o:hrstd="t" o:hr="t" fillcolor="#a0a0a0" stroked="f"/>
         </w:pict>
       </w:r>
@@ -21697,13 +21677,8 @@
     </w:p>
     <w:p>
       <w:r>
-        <w:rPr>
-          <w:noProof/>
-        </w:rPr>
-      </w:r>
-      <w:r>
-        <w:pict w14:anchorId="3C793995">
-          <v:rect id="Rectangle 21" o:spid="_x0000_s1036" style="width:7in;height:.1pt;visibility:visible;mso-wrap-style:square;mso-left-percent:-10001;mso-top-percent:-10001;mso-position-horizontal:absolute;mso-position-horizontal-relative:char;mso-position-vertical:absolute;mso-position-vertical-relative:line;mso-left-percent:-10001;mso-top-percent:-10001;v-text-anchor:top" o:gfxdata="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" filled="f">
+        <w:pict w14:anchorId="2035C469">
+          <v:rect id="Rectangle 21" o:spid="_x0000_s1036" alt="" style="width:7in;height:.1pt;visibility:visible;mso-wrap-style:square;mso-width-percent:0;mso-height-percent:0;mso-left-percent:-10001;mso-top-percent:-10001;mso-position-horizontal:absolute;mso-position-horizontal-relative:char;mso-position-vertical:absolute;mso-position-vertical-relative:line;mso-width-percent:0;mso-height-percent:0;mso-left-percent:-10001;mso-top-percent:-10001;v-text-anchor:top" filled="f">
             <o:lock v:ext="edit" aspectratio="t"/>
             <w10:anchorlock/>
           </v:rect>
@@ -21726,13 +21701,8 @@
     </w:p>
     <w:p>
       <w:r>
-        <w:rPr>
-          <w:noProof/>
-        </w:rPr>
-      </w:r>
-      <w:r>
-        <w:pict w14:anchorId="6A7FA39D">
-          <v:rect id="Rectangle 19" o:spid="_x0000_s1035" style="width:7in;height:.1pt;visibility:visible;mso-wrap-style:square;mso-left-percent:-10001;mso-top-percent:-10001;mso-position-horizontal:absolute;mso-position-horizontal-relative:char;mso-position-vertical:absolute;mso-position-vertical-relative:line;mso-left-percent:-10001;mso-top-percent:-10001;v-text-anchor:top" o:gfxdata="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" filled="f">
+        <w:pict w14:anchorId="055135DF">
+          <v:rect id="Rectangle 19" o:spid="_x0000_s1035" alt="" style="width:7in;height:.1pt;visibility:visible;mso-wrap-style:square;mso-width-percent:0;mso-height-percent:0;mso-left-percent:-10001;mso-top-percent:-10001;mso-position-horizontal:absolute;mso-position-horizontal-relative:char;mso-position-vertical:absolute;mso-position-vertical-relative:line;mso-width-percent:0;mso-height-percent:0;mso-left-percent:-10001;mso-top-percent:-10001;v-text-anchor:top" filled="f">
             <o:lock v:ext="edit" aspectratio="t"/>
             <w10:anchorlock/>
           </v:rect>
@@ -21818,13 +21788,8 @@
     </w:p>
     <w:p>
       <w:r>
-        <w:rPr>
-          <w:noProof/>
-        </w:rPr>
-      </w:r>
-      <w:r>
-        <w:pict w14:anchorId="24361C15">
-          <v:rect id="Rectangle 17" o:spid="_x0000_s1034" style="width:7in;height:.1pt;visibility:visible;mso-wrap-style:square;mso-left-percent:-10001;mso-top-percent:-10001;mso-position-horizontal:absolute;mso-position-horizontal-relative:char;mso-position-vertical:absolute;mso-position-vertical-relative:line;mso-left-percent:-10001;mso-top-percent:-10001;v-text-anchor:top" o:gfxdata="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" filled="f">
+        <w:pict w14:anchorId="2EFCCF2C">
+          <v:rect id="Rectangle 17" o:spid="_x0000_s1034" alt="" style="width:7in;height:.1pt;visibility:visible;mso-wrap-style:square;mso-width-percent:0;mso-height-percent:0;mso-left-percent:-10001;mso-top-percent:-10001;mso-position-horizontal:absolute;mso-position-horizontal-relative:char;mso-position-vertical:absolute;mso-position-vertical-relative:line;mso-width-percent:0;mso-height-percent:0;mso-left-percent:-10001;mso-top-percent:-10001;v-text-anchor:top" filled="f">
             <o:lock v:ext="edit" aspectratio="t"/>
             <w10:anchorlock/>
           </v:rect>
@@ -21966,13 +21931,8 @@
     </w:p>
     <w:p>
       <w:r>
-        <w:rPr>
-          <w:noProof/>
-        </w:rPr>
-      </w:r>
-      <w:r>
-        <w:pict w14:anchorId="234BB2A3">
-          <v:rect id="Rectangle 15" o:spid="_x0000_s1033" style="width:7in;height:.1pt;visibility:visible;mso-wrap-style:square;mso-left-percent:-10001;mso-top-percent:-10001;mso-position-horizontal:absolute;mso-position-horizontal-relative:char;mso-position-vertical:absolute;mso-position-vertical-relative:line;mso-left-percent:-10001;mso-top-percent:-10001;v-text-anchor:top" o:gfxdata="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" filled="f">
+        <w:pict w14:anchorId="13989E83">
+          <v:rect id="Rectangle 15" o:spid="_x0000_s1033" alt="" style="width:7in;height:.1pt;visibility:visible;mso-wrap-style:square;mso-width-percent:0;mso-height-percent:0;mso-left-percent:-10001;mso-top-percent:-10001;mso-position-horizontal:absolute;mso-position-horizontal-relative:char;mso-position-vertical:absolute;mso-position-vertical-relative:line;mso-width-percent:0;mso-height-percent:0;mso-left-percent:-10001;mso-top-percent:-10001;v-text-anchor:top" filled="f">
             <o:lock v:ext="edit" aspectratio="t"/>
             <w10:anchorlock/>
           </v:rect>
@@ -22149,13 +22109,8 @@
     </w:p>
     <w:p>
       <w:r>
-        <w:rPr>
-          <w:noProof/>
-        </w:rPr>
-      </w:r>
-      <w:r>
-        <w:pict w14:anchorId="1694DE62">
-          <v:rect id="Rectangle 13" o:spid="_x0000_s1032" style="width:7in;height:.1pt;visibility:visible;mso-wrap-style:square;mso-left-percent:-10001;mso-top-percent:-10001;mso-position-horizontal:absolute;mso-position-horizontal-relative:char;mso-position-vertical:absolute;mso-position-vertical-relative:line;mso-left-percent:-10001;mso-top-percent:-10001;v-text-anchor:top" o:gfxdata="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" filled="f">
+        <w:pict w14:anchorId="26584596">
+          <v:rect id="Rectangle 13" o:spid="_x0000_s1032" alt="" style="width:7in;height:.1pt;visibility:visible;mso-wrap-style:square;mso-width-percent:0;mso-height-percent:0;mso-left-percent:-10001;mso-top-percent:-10001;mso-position-horizontal:absolute;mso-position-horizontal-relative:char;mso-position-vertical:absolute;mso-position-vertical-relative:line;mso-width-percent:0;mso-height-percent:0;mso-left-percent:-10001;mso-top-percent:-10001;v-text-anchor:top" filled="f">
             <o:lock v:ext="edit" aspectratio="t"/>
             <w10:anchorlock/>
           </v:rect>
@@ -22414,13 +22369,8 @@
     </w:p>
     <w:p>
       <w:r>
-        <w:rPr>
-          <w:noProof/>
-        </w:rPr>
-      </w:r>
-      <w:r>
-        <w:pict w14:anchorId="51983C2F">
-          <v:rect id="Rectangle 11" o:spid="_x0000_s1031" style="width:7in;height:.1pt;visibility:visible;mso-wrap-style:square;mso-left-percent:-10001;mso-top-percent:-10001;mso-position-horizontal:absolute;mso-position-horizontal-relative:char;mso-position-vertical:absolute;mso-position-vertical-relative:line;mso-left-percent:-10001;mso-top-percent:-10001;v-text-anchor:top" o:gfxdata="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" filled="f">
+        <w:pict w14:anchorId="5331860F">
+          <v:rect id="Rectangle 11" o:spid="_x0000_s1031" alt="" style="width:7in;height:.1pt;visibility:visible;mso-wrap-style:square;mso-width-percent:0;mso-height-percent:0;mso-left-percent:-10001;mso-top-percent:-10001;mso-position-horizontal:absolute;mso-position-horizontal-relative:char;mso-position-vertical:absolute;mso-position-vertical-relative:line;mso-width-percent:0;mso-height-percent:0;mso-left-percent:-10001;mso-top-percent:-10001;v-text-anchor:top" filled="f">
             <o:lock v:ext="edit" aspectratio="t"/>
             <w10:anchorlock/>
           </v:rect>
@@ -22705,7 +22655,7 @@
         <w:rPr>
           <w:noProof/>
         </w:rPr>
-        <w:pict w14:anchorId="5C4C9A03">
+        <w:pict w14:anchorId="1BDFAB7A">
           <v:rect id="_x0000_i1036" alt="" style="width:468pt;height:.05pt;mso-width-percent:0;mso-height-percent:0;mso-width-percent:0;mso-height-percent:0" o:hralign="center" o:hrstd="t" o:hr="t" fillcolor="#a0a0a0" stroked="f"/>
         </w:pict>
       </w:r>
@@ -22876,7 +22826,7 @@
         <w:rPr>
           <w:noProof/>
         </w:rPr>
-        <w:pict w14:anchorId="477969A6">
+        <w:pict w14:anchorId="7546540F">
           <v:rect id="_x0000_i1035" alt="" style="width:468pt;height:.05pt;mso-width-percent:0;mso-height-percent:0;mso-width-percent:0;mso-height-percent:0" o:hralign="center" o:hrstd="t" o:hr="t" fillcolor="#a0a0a0" stroked="f"/>
         </w:pict>
       </w:r>
@@ -23026,7 +22976,7 @@
         <w:rPr>
           <w:noProof/>
         </w:rPr>
-        <w:pict w14:anchorId="721D0D6A">
+        <w:pict w14:anchorId="39E67877">
           <v:rect id="_x0000_i1034" alt="" style="width:468pt;height:.05pt;mso-width-percent:0;mso-height-percent:0;mso-width-percent:0;mso-height-percent:0" o:hralign="center" o:hrstd="t" o:hr="t" fillcolor="#a0a0a0" stroked="f"/>
         </w:pict>
       </w:r>
@@ -23147,7 +23097,7 @@
         <w:rPr>
           <w:noProof/>
         </w:rPr>
-        <w:pict w14:anchorId="5969E12B">
+        <w:pict w14:anchorId="3B7DE0AB">
           <v:rect id="_x0000_i1033" alt="" style="width:468pt;height:.05pt;mso-width-percent:0;mso-height-percent:0;mso-width-percent:0;mso-height-percent:0" o:hralign="center" o:hrstd="t" o:hr="t" fillcolor="#a0a0a0" stroked="f"/>
         </w:pict>
       </w:r>
@@ -23367,7 +23317,7 @@
         <w:rPr>
           <w:noProof/>
         </w:rPr>
-        <w:pict w14:anchorId="3D2D8AA0">
+        <w:pict w14:anchorId="13DD20D1">
           <v:rect id="_x0000_i1032" alt="" style="width:468pt;height:.05pt;mso-width-percent:0;mso-height-percent:0;mso-width-percent:0;mso-height-percent:0" o:hralign="center" o:hrstd="t" o:hr="t" fillcolor="#a0a0a0" stroked="f"/>
         </w:pict>
       </w:r>
@@ -23570,7 +23520,7 @@
         <w:rPr>
           <w:noProof/>
         </w:rPr>
-        <w:pict w14:anchorId="684FCE30">
+        <w:pict w14:anchorId="5693E13E">
           <v:rect id="_x0000_i1031" alt="" style="width:468pt;height:.05pt;mso-width-percent:0;mso-height-percent:0;mso-width-percent:0;mso-height-percent:0" o:hralign="center" o:hrstd="t" o:hr="t" fillcolor="#a0a0a0" stroked="f"/>
         </w:pict>
       </w:r>
@@ -23594,7 +23544,7 @@
         <w:rPr>
           <w:noProof/>
         </w:rPr>
-        <w:pict w14:anchorId="2A66DC15">
+        <w:pict w14:anchorId="075568B1">
           <v:rect id="_x0000_i1030" alt="" style="width:468pt;height:.05pt;mso-width-percent:0;mso-height-percent:0;mso-width-percent:0;mso-height-percent:0" o:hralign="center" o:hrstd="t" o:hr="t" fillcolor="#a0a0a0" stroked="f"/>
         </w:pict>
       </w:r>
@@ -23763,13 +23713,8 @@
     </w:p>
     <w:p>
       <w:r>
-        <w:rPr>
-          <w:noProof/>
-        </w:rPr>
-      </w:r>
-      <w:r>
-        <w:pict w14:anchorId="366AA9BF">
-          <v:rect id="Rectangle 9" o:spid="_x0000_s1030" style="width:7in;height:.1pt;visibility:visible;mso-wrap-style:square;mso-left-percent:-10001;mso-top-percent:-10001;mso-position-horizontal:absolute;mso-position-horizontal-relative:char;mso-position-vertical:absolute;mso-position-vertical-relative:line;mso-left-percent:-10001;mso-top-percent:-10001;v-text-anchor:top" o:gfxdata="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" filled="f">
+        <w:pict w14:anchorId="4DC1CFF7">
+          <v:rect id="Rectangle 9" o:spid="_x0000_s1030" alt="" style="width:7in;height:.1pt;visibility:visible;mso-wrap-style:square;mso-width-percent:0;mso-height-percent:0;mso-left-percent:-10001;mso-top-percent:-10001;mso-position-horizontal:absolute;mso-position-horizontal-relative:char;mso-position-vertical:absolute;mso-position-vertical-relative:line;mso-width-percent:0;mso-height-percent:0;mso-left-percent:-10001;mso-top-percent:-10001;v-text-anchor:top" filled="f">
             <o:lock v:ext="edit" aspectratio="t"/>
             <w10:anchorlock/>
           </v:rect>
@@ -24009,13 +23954,8 @@
     </w:p>
     <w:p>
       <w:r>
-        <w:rPr>
-          <w:noProof/>
-        </w:rPr>
-      </w:r>
-      <w:r>
-        <w:pict w14:anchorId="36B53974">
-          <v:rect id="Rectangle 7" o:spid="_x0000_s1029" style="width:7in;height:.1pt;visibility:visible;mso-wrap-style:square;mso-left-percent:-10001;mso-top-percent:-10001;mso-position-horizontal:absolute;mso-position-horizontal-relative:char;mso-position-vertical:absolute;mso-position-vertical-relative:line;mso-left-percent:-10001;mso-top-percent:-10001;v-text-anchor:top" o:gfxdata="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" filled="f">
+        <w:pict w14:anchorId="49B32B62">
+          <v:rect id="Rectangle 7" o:spid="_x0000_s1029" alt="" style="width:7in;height:.1pt;visibility:visible;mso-wrap-style:square;mso-width-percent:0;mso-height-percent:0;mso-left-percent:-10001;mso-top-percent:-10001;mso-position-horizontal:absolute;mso-position-horizontal-relative:char;mso-position-vertical:absolute;mso-position-vertical-relative:line;mso-width-percent:0;mso-height-percent:0;mso-left-percent:-10001;mso-top-percent:-10001;v-text-anchor:top" filled="f">
             <o:lock v:ext="edit" aspectratio="t"/>
             <w10:anchorlock/>
           </v:rect>
@@ -24208,13 +24148,8 @@
     </w:p>
     <w:p>
       <w:r>
-        <w:rPr>
-          <w:noProof/>
-        </w:rPr>
-      </w:r>
-      <w:r>
-        <w:pict w14:anchorId="257BDFB9">
-          <v:rect id="Rectangle 5" o:spid="_x0000_s1028" style="width:7in;height:.1pt;visibility:visible;mso-wrap-style:square;mso-left-percent:-10001;mso-top-percent:-10001;mso-position-horizontal:absolute;mso-position-horizontal-relative:char;mso-position-vertical:absolute;mso-position-vertical-relative:line;mso-left-percent:-10001;mso-top-percent:-10001;v-text-anchor:top" o:gfxdata="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" filled="f">
+        <w:pict w14:anchorId="3E757CAD">
+          <v:rect id="Rectangle 5" o:spid="_x0000_s1028" alt="" style="width:7in;height:.1pt;visibility:visible;mso-wrap-style:square;mso-width-percent:0;mso-height-percent:0;mso-left-percent:-10001;mso-top-percent:-10001;mso-position-horizontal:absolute;mso-position-horizontal-relative:char;mso-position-vertical:absolute;mso-position-vertical-relative:line;mso-width-percent:0;mso-height-percent:0;mso-left-percent:-10001;mso-top-percent:-10001;v-text-anchor:top" filled="f">
             <o:lock v:ext="edit" aspectratio="t"/>
             <w10:anchorlock/>
           </v:rect>
@@ -24386,13 +24321,8 @@
     </w:p>
     <w:p>
       <w:r>
-        <w:rPr>
-          <w:noProof/>
-        </w:rPr>
-      </w:r>
-      <w:r>
-        <w:pict w14:anchorId="18069E88">
-          <v:rect id="Rectangle 3" o:spid="_x0000_s1027" style="width:7in;height:.1pt;visibility:visible;mso-wrap-style:square;mso-left-percent:-10001;mso-top-percent:-10001;mso-position-horizontal:absolute;mso-position-horizontal-relative:char;mso-position-vertical:absolute;mso-position-vertical-relative:line;mso-left-percent:-10001;mso-top-percent:-10001;v-text-anchor:top" o:gfxdata="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" filled="f">
+        <w:pict w14:anchorId="5C8B8D3A">
+          <v:rect id="Rectangle 3" o:spid="_x0000_s1027" alt="" style="width:7in;height:.1pt;visibility:visible;mso-wrap-style:square;mso-width-percent:0;mso-height-percent:0;mso-left-percent:-10001;mso-top-percent:-10001;mso-position-horizontal:absolute;mso-position-horizontal-relative:char;mso-position-vertical:absolute;mso-position-vertical-relative:line;mso-width-percent:0;mso-height-percent:0;mso-left-percent:-10001;mso-top-percent:-10001;v-text-anchor:top" filled="f">
             <o:lock v:ext="edit" aspectratio="t"/>
             <w10:anchorlock/>
           </v:rect>
@@ -24670,13 +24600,8 @@
     </w:p>
     <w:p>
       <w:r>
-        <w:rPr>
-          <w:noProof/>
-        </w:rPr>
-      </w:r>
-      <w:r>
-        <w:pict w14:anchorId="405A1A1A">
-          <v:rect id="Rectangle 1" o:spid="_x0000_s1026" style="width:7in;height:.1pt;visibility:visible;mso-wrap-style:square;mso-left-percent:-10001;mso-top-percent:-10001;mso-position-horizontal:absolute;mso-position-horizontal-relative:char;mso-position-vertical:absolute;mso-position-vertical-relative:line;mso-left-percent:-10001;mso-top-percent:-10001;v-text-anchor:top" o:gfxdata="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" filled="f">
+        <w:pict w14:anchorId="55D68DBE">
+          <v:rect id="Rectangle 1" o:spid="_x0000_s1026" alt="" style="width:7in;height:.1pt;visibility:visible;mso-wrap-style:square;mso-width-percent:0;mso-height-percent:0;mso-left-percent:-10001;mso-top-percent:-10001;mso-position-horizontal:absolute;mso-position-horizontal-relative:char;mso-position-vertical:absolute;mso-position-vertical-relative:line;mso-width-percent:0;mso-height-percent:0;mso-left-percent:-10001;mso-top-percent:-10001;v-text-anchor:top" filled="f">
             <o:lock v:ext="edit" aspectratio="t"/>
             <w10:anchorlock/>
           </v:rect>

</xml_diff>